<commit_message>
Fix GitHub KaTeX math mode syntax and embed all 15 high-res research figures in report and docx
</commit_message>
<xml_diff>
--- a/RESEARCH_PROJECT_REPORT.docx
+++ b/RESEARCH_PROJECT_REPORT.docx
@@ -959,6 +959,15 @@
       </w:pPr>
       <w:r>
         <w:t>10.6 Stability Analysis (PSI / CSI) ................................................................. 28</w:t>
+      </w:r>
+    </w:p>
+    <w:p>
+      <w:pPr>
+        <w:pStyle w:val="ListBullet"/>
+        <w:spacing w:after="60" w:line="276" w:lineRule="auto"/>
+      </w:pPr>
+      <w:r>
+        <w:t>10.7 Explainable AI (XAI) &amp; SHAP TreeExplainer ...................................................... 29</w:t>
       </w:r>
     </w:p>
     <w:p>
@@ -4677,6 +4686,60 @@
       </w:r>
     </w:p>
     <w:p>
+      <w:pPr>
+        <w:spacing w:before="200" w:after="80"/>
+        <w:jc w:val="center"/>
+      </w:pPr>
+      <w:r>
+        <w:drawing>
+          <wp:inline xmlns:a="http://schemas.openxmlformats.org/drawingml/2006/main" xmlns:pic="http://schemas.openxmlformats.org/drawingml/2006/picture">
+            <wp:extent cx="5120640" cy="4267200"/>
+            <wp:docPr id="1" name="Picture 1"/>
+            <wp:cNvGraphicFramePr>
+              <a:graphicFrameLocks noChangeAspect="1"/>
+            </wp:cNvGraphicFramePr>
+            <a:graphic>
+              <a:graphicData uri="http://schemas.openxmlformats.org/drawingml/2006/picture">
+                <pic:pic>
+                  <pic:nvPicPr>
+                    <pic:cNvPr id="0" name="fig1_class_balance.png"/>
+                    <pic:cNvPicPr/>
+                  </pic:nvPicPr>
+                  <pic:blipFill>
+                    <a:blip r:embed="rId9"/>
+                    <a:stretch>
+                      <a:fillRect/>
+                    </a:stretch>
+                  </pic:blipFill>
+                  <pic:spPr>
+                    <a:xfrm>
+                      <a:off x="0" y="0"/>
+                      <a:ext cx="5120640" cy="4267200"/>
+                    </a:xfrm>
+                    <a:prstGeom prst="rect"/>
+                  </pic:spPr>
+                </pic:pic>
+              </a:graphicData>
+            </a:graphic>
+          </wp:inline>
+        </w:drawing>
+      </w:r>
+    </w:p>
+    <w:p>
+      <w:pPr>
+        <w:spacing w:before="40" w:after="200"/>
+        <w:jc w:val="center"/>
+      </w:pPr>
+      <w:r>
+        <w:rPr>
+          <w:i/>
+          <w:color w:val="64748B"/>
+          <w:sz w:val="19"/>
+        </w:rPr>
+        <w:t>Figure 1: Distribution of loan repayment status across 100,000 institutional records (64.36% Fully Paid vs. 35.64% Default).</w:t>
+      </w:r>
+    </w:p>
+    <w:p>
       <w:r>
         <w:br w:type="page"/>
       </w:r>
@@ -4769,6 +4832,60 @@
     </w:p>
     <w:p>
       <w:pPr>
+        <w:spacing w:before="200" w:after="80"/>
+        <w:jc w:val="center"/>
+      </w:pPr>
+      <w:r>
+        <w:drawing>
+          <wp:inline xmlns:a="http://schemas.openxmlformats.org/drawingml/2006/main" xmlns:pic="http://schemas.openxmlformats.org/drawingml/2006/picture">
+            <wp:extent cx="5120640" cy="2094807"/>
+            <wp:docPr id="2" name="Picture 2"/>
+            <wp:cNvGraphicFramePr>
+              <a:graphicFrameLocks noChangeAspect="1"/>
+            </wp:cNvGraphicFramePr>
+            <a:graphic>
+              <a:graphicData uri="http://schemas.openxmlformats.org/drawingml/2006/picture">
+                <pic:pic>
+                  <pic:nvPicPr>
+                    <pic:cNvPr id="0" name="fig2_income_loan_distributions.png"/>
+                    <pic:cNvPicPr/>
+                  </pic:nvPicPr>
+                  <pic:blipFill>
+                    <a:blip r:embed="rId10"/>
+                    <a:stretch>
+                      <a:fillRect/>
+                    </a:stretch>
+                  </pic:blipFill>
+                  <pic:spPr>
+                    <a:xfrm>
+                      <a:off x="0" y="0"/>
+                      <a:ext cx="5120640" cy="2094807"/>
+                    </a:xfrm>
+                    <a:prstGeom prst="rect"/>
+                  </pic:spPr>
+                </pic:pic>
+              </a:graphicData>
+            </a:graphic>
+          </wp:inline>
+        </w:drawing>
+      </w:r>
+    </w:p>
+    <w:p>
+      <w:pPr>
+        <w:spacing w:before="40" w:after="200"/>
+        <w:jc w:val="center"/>
+      </w:pPr>
+      <w:r>
+        <w:rPr>
+          <w:i/>
+          <w:color w:val="64748B"/>
+          <w:sz w:val="19"/>
+        </w:rPr>
+        <w:t>Figure 2: Empirical distributions of applicant verified annual income and requested loan amounts.</w:t>
+      </w:r>
+    </w:p>
+    <w:p>
+      <w:pPr>
         <w:pStyle w:val="Heading3"/>
         <w:spacing w:before="200" w:after="60"/>
       </w:pPr>
@@ -4939,6 +5056,114 @@
     </w:p>
     <w:p>
       <w:pPr>
+        <w:spacing w:before="200" w:after="80"/>
+        <w:jc w:val="center"/>
+      </w:pPr>
+      <w:r>
+        <w:drawing>
+          <wp:inline xmlns:a="http://schemas.openxmlformats.org/drawingml/2006/main" xmlns:pic="http://schemas.openxmlformats.org/drawingml/2006/picture">
+            <wp:extent cx="5120640" cy="3291840"/>
+            <wp:docPr id="3" name="Picture 3"/>
+            <wp:cNvGraphicFramePr>
+              <a:graphicFrameLocks noChangeAspect="1"/>
+            </wp:cNvGraphicFramePr>
+            <a:graphic>
+              <a:graphicData uri="http://schemas.openxmlformats.org/drawingml/2006/picture">
+                <pic:pic>
+                  <pic:nvPicPr>
+                    <pic:cNvPr id="0" name="fig3_grade_default_escalation.png"/>
+                    <pic:cNvPicPr/>
+                  </pic:nvPicPr>
+                  <pic:blipFill>
+                    <a:blip r:embed="rId11"/>
+                    <a:stretch>
+                      <a:fillRect/>
+                    </a:stretch>
+                  </pic:blipFill>
+                  <pic:spPr>
+                    <a:xfrm>
+                      <a:off x="0" y="0"/>
+                      <a:ext cx="5120640" cy="3291840"/>
+                    </a:xfrm>
+                    <a:prstGeom prst="rect"/>
+                  </pic:spPr>
+                </pic:pic>
+              </a:graphicData>
+            </a:graphic>
+          </wp:inline>
+        </w:drawing>
+      </w:r>
+    </w:p>
+    <w:p>
+      <w:pPr>
+        <w:spacing w:before="40" w:after="200"/>
+        <w:jc w:val="center"/>
+      </w:pPr>
+      <w:r>
+        <w:rPr>
+          <w:i/>
+          <w:color w:val="64748B"/>
+          <w:sz w:val="19"/>
+        </w:rPr>
+        <w:t>Figure 3: Exponential default rate escalation observed across credit rating grades B through G.</w:t>
+      </w:r>
+    </w:p>
+    <w:p>
+      <w:pPr>
+        <w:spacing w:before="200" w:after="80"/>
+        <w:jc w:val="center"/>
+      </w:pPr>
+      <w:r>
+        <w:drawing>
+          <wp:inline xmlns:a="http://schemas.openxmlformats.org/drawingml/2006/main" xmlns:pic="http://schemas.openxmlformats.org/drawingml/2006/picture">
+            <wp:extent cx="5120640" cy="3072384"/>
+            <wp:docPr id="4" name="Picture 4"/>
+            <wp:cNvGraphicFramePr>
+              <a:graphicFrameLocks noChangeAspect="1"/>
+            </wp:cNvGraphicFramePr>
+            <a:graphic>
+              <a:graphicData uri="http://schemas.openxmlformats.org/drawingml/2006/picture">
+                <pic:pic>
+                  <pic:nvPicPr>
+                    <pic:cNvPr id="0" name="fig4_fico_vs_default.png"/>
+                    <pic:cNvPicPr/>
+                  </pic:nvPicPr>
+                  <pic:blipFill>
+                    <a:blip r:embed="rId12"/>
+                    <a:stretch>
+                      <a:fillRect/>
+                    </a:stretch>
+                  </pic:blipFill>
+                  <pic:spPr>
+                    <a:xfrm>
+                      <a:off x="0" y="0"/>
+                      <a:ext cx="5120640" cy="3072384"/>
+                    </a:xfrm>
+                    <a:prstGeom prst="rect"/>
+                  </pic:spPr>
+                </pic:pic>
+              </a:graphicData>
+            </a:graphic>
+          </wp:inline>
+        </w:drawing>
+      </w:r>
+    </w:p>
+    <w:p>
+      <w:pPr>
+        <w:spacing w:before="40" w:after="200"/>
+        <w:jc w:val="center"/>
+      </w:pPr>
+      <w:r>
+        <w:rPr>
+          <w:i/>
+          <w:color w:val="64748B"/>
+          <w:sz w:val="19"/>
+        </w:rPr>
+        <w:t>Figure 4: Kernel density estimates (KDE) of borrower credit bureau FICO scores stratified by repayment status.</w:t>
+      </w:r>
+    </w:p>
+    <w:p>
+      <w:pPr>
         <w:pStyle w:val="Heading3"/>
         <w:spacing w:before="200" w:after="60"/>
       </w:pPr>
@@ -4985,6 +5210,60 @@
       </w:pPr>
       <w:r>
         <w:t>`int_rate` and `grade` share strong correlation ($r = 0.74$), reflecting credit risk tiering.</w:t>
+      </w:r>
+    </w:p>
+    <w:p>
+      <w:pPr>
+        <w:spacing w:before="200" w:after="80"/>
+        <w:jc w:val="center"/>
+      </w:pPr>
+      <w:r>
+        <w:drawing>
+          <wp:inline xmlns:a="http://schemas.openxmlformats.org/drawingml/2006/main" xmlns:pic="http://schemas.openxmlformats.org/drawingml/2006/picture">
+            <wp:extent cx="5120640" cy="3915784"/>
+            <wp:docPr id="5" name="Picture 5"/>
+            <wp:cNvGraphicFramePr>
+              <a:graphicFrameLocks noChangeAspect="1"/>
+            </wp:cNvGraphicFramePr>
+            <a:graphic>
+              <a:graphicData uri="http://schemas.openxmlformats.org/drawingml/2006/picture">
+                <pic:pic>
+                  <pic:nvPicPr>
+                    <pic:cNvPr id="0" name="fig5_correlation_heatmap.png"/>
+                    <pic:cNvPicPr/>
+                  </pic:nvPicPr>
+                  <pic:blipFill>
+                    <a:blip r:embed="rId13"/>
+                    <a:stretch>
+                      <a:fillRect/>
+                    </a:stretch>
+                  </pic:blipFill>
+                  <pic:spPr>
+                    <a:xfrm>
+                      <a:off x="0" y="0"/>
+                      <a:ext cx="5120640" cy="3915784"/>
+                    </a:xfrm>
+                    <a:prstGeom prst="rect"/>
+                  </pic:spPr>
+                </pic:pic>
+              </a:graphicData>
+            </a:graphic>
+          </wp:inline>
+        </w:drawing>
+      </w:r>
+    </w:p>
+    <w:p>
+      <w:pPr>
+        <w:spacing w:before="40" w:after="200"/>
+        <w:jc w:val="center"/>
+      </w:pPr>
+      <w:r>
+        <w:rPr>
+          <w:i/>
+          <w:color w:val="64748B"/>
+          <w:sz w:val="19"/>
+        </w:rPr>
+        <w:t>Figure 5: Pearson correlation matrix across numerical borrower financial and credit history variables.</w:t>
       </w:r>
     </w:p>
     <w:p>
@@ -5788,84 +6067,55 @@
         <w:rPr>
           <w:b/>
         </w:rPr>
-        <w:t>`installment_to_inc`:</w:t>
-      </w:r>
-      <w:r>
-        <w:t xml:space="preserve"> Monthly payment burden relative to monthly income:</w:t>
-      </w:r>
-    </w:p>
-    <w:p>
-      <w:pPr>
-        <w:spacing w:after="100" w:line="276" w:lineRule="auto"/>
-      </w:pPr>
-      <w:r>
-        <w:t>$$\text{installment\_to\_inc} = \frac{\text{installment} \times 12}{\text{annual\_inc} + 1}$$</w:t>
-      </w:r>
-    </w:p>
-    <w:p>
-      <w:pPr>
-        <w:spacing w:after="100" w:line="276" w:lineRule="auto"/>
-      </w:pPr>
-      <w:r>
-        <w:t>*Hypothesis:* High debt-servicing strain leaves zero cushion for unexpected financial shocks.</w:t>
-      </w:r>
-    </w:p>
-    <w:p>
-      <w:pPr>
-        <w:spacing w:after="100" w:line="276" w:lineRule="auto"/>
-      </w:pPr>
-      <w:r>
-        <w:t xml:space="preserve">2. </w:t>
-      </w:r>
+        <w:t>`installment_to_inc` (Monthly Debt Service Burden):</w:t>
+      </w:r>
+      <w:r/>
+    </w:p>
+    <w:p>
+      <w:pPr>
+        <w:pStyle w:val="ListBullet"/>
+        <w:spacing w:after="60" w:line="276" w:lineRule="auto"/>
+      </w:pPr>
+      <w:r/>
       <w:r>
         <w:rPr>
           <w:b/>
         </w:rPr>
-        <w:t>`loan_to_inc`:</w:t>
-      </w:r>
-      <w:r>
-        <w:t xml:space="preserve"> Total requested principal relative to verified annual income:</w:t>
-      </w:r>
-    </w:p>
-    <w:p>
-      <w:pPr>
-        <w:spacing w:after="100" w:line="276" w:lineRule="auto"/>
-      </w:pPr>
-      <w:r>
-        <w:t>$$\text{loan\_to\_inc} = \frac{\text{loan\_amnt}}{\text{annual\_inc} + 1}$$</w:t>
-      </w:r>
-    </w:p>
-    <w:p>
-      <w:pPr>
-        <w:spacing w:after="100" w:line="276" w:lineRule="auto"/>
-      </w:pPr>
-      <w:r>
-        <w:t>*Hypothesis:* Borrowers requesting loans exceeding 40% of their annual salary carry substantially higher default rates.</w:t>
-      </w:r>
-    </w:p>
-    <w:p>
-      <w:pPr>
-        <w:spacing w:after="100" w:line="276" w:lineRule="auto"/>
-      </w:pPr>
-      <w:r>
-        <w:t xml:space="preserve">3. </w:t>
-      </w:r>
+        <w:t>Implementation Formula:</w:t>
+      </w:r>
+      <w:r>
+        <w:t xml:space="preserve"> `installment_to_inc = (installment * 12.0) / (annual_inc + 1.0)`</w:t>
+      </w:r>
+    </w:p>
+    <w:p>
+      <w:pPr>
+        <w:pStyle w:val="ListBullet"/>
+        <w:spacing w:after="60" w:line="276" w:lineRule="auto"/>
+      </w:pPr>
+      <w:r/>
       <w:r>
         <w:rPr>
           <w:b/>
         </w:rPr>
-        <w:t>`interest_burden_annual`:</w:t>
-      </w:r>
-      <w:r>
-        <w:t xml:space="preserve"> Annual gross interest cost borne by the borrower:</w:t>
-      </w:r>
+        <w:t>Mathematical Formulation:</w:t>
+      </w:r>
+      <w:r/>
     </w:p>
     <w:p>
       <w:pPr>
         <w:spacing w:after="100" w:line="276" w:lineRule="auto"/>
       </w:pPr>
       <w:r>
-        <w:t>$$\text{interest\_burden\_annual} = \text{loan\_amnt} \times \left(\frac{\text{int\_rate}}{100}\right)$$</w:t>
+        <w:t>$$\text{Installment-to-Income} = \frac{\text{Monthly Installment} \times 12}{\text{Annual Income} + 1}$$</w:t>
+      </w:r>
+    </w:p>
+    <w:p>
+      <w:pPr>
+        <w:pStyle w:val="ListBullet"/>
+        <w:spacing w:after="60" w:line="276" w:lineRule="auto"/>
+      </w:pPr>
+      <w:r>
+        <w:t>*Underwriting Hypothesis:* High debt-servicing strain leaves zero liquidity cushion for unforeseen financial shocks.</w:t>
       </w:r>
     </w:p>
     <w:p>
@@ -5873,82 +6123,309 @@
         <w:spacing w:after="100" w:line="276" w:lineRule="auto"/>
       </w:pPr>
       <w:r>
-        <w:t>*Hypothesis:* Absolute compounding interest load drives borrower delinquency.</w:t>
-      </w:r>
-    </w:p>
-    <w:p>
-      <w:pPr>
-        <w:spacing w:after="100" w:line="276" w:lineRule="auto"/>
-      </w:pPr>
-      <w:r>
-        <w:t xml:space="preserve">4. </w:t>
+        <w:t xml:space="preserve">2. </w:t>
       </w:r>
       <w:r>
         <w:rPr>
           <w:b/>
         </w:rPr>
-        <w:t>`high_util_flag`:</w:t>
-      </w:r>
-      <w:r>
-        <w:t xml:space="preserve"> Binary indicator identifying revolving utilization $&gt; 75\%$:</w:t>
-      </w:r>
-    </w:p>
-    <w:p>
-      <w:pPr>
-        <w:spacing w:after="100" w:line="276" w:lineRule="auto"/>
-      </w:pPr>
-      <w:r>
-        <w:t>$$\text{high\_util\_flag} = \mathbb{I}(\text{revol\_util} &gt; 75.0)$$</w:t>
-      </w:r>
-    </w:p>
-    <w:p>
-      <w:pPr>
-        <w:spacing w:after="100" w:line="276" w:lineRule="auto"/>
-      </w:pPr>
-      <w:r>
-        <w:t xml:space="preserve">5. </w:t>
-      </w:r>
+        <w:t>`loan_to_inc` (Total Leverage Exposure):</w:t>
+      </w:r>
+      <w:r/>
+    </w:p>
+    <w:p>
+      <w:pPr>
+        <w:pStyle w:val="ListBullet"/>
+        <w:spacing w:after="60" w:line="276" w:lineRule="auto"/>
+      </w:pPr>
+      <w:r/>
       <w:r>
         <w:rPr>
           <w:b/>
         </w:rPr>
-        <w:t>`derogatory_flag`:</w:t>
-      </w:r>
-      <w:r>
-        <w:t xml:space="preserve"> Indicator of past credit trauma:</w:t>
-      </w:r>
-    </w:p>
-    <w:p>
-      <w:pPr>
-        <w:spacing w:after="100" w:line="276" w:lineRule="auto"/>
-      </w:pPr>
-      <w:r>
-        <w:t>$$\text{derogatory\_flag} = \mathbb{I}(\text{delinq\_2yrs} &gt; 0 \lor \text{pub\_rec} &gt; 0)$$</w:t>
-      </w:r>
-    </w:p>
-    <w:p>
-      <w:pPr>
-        <w:spacing w:after="100" w:line="276" w:lineRule="auto"/>
-      </w:pPr>
-      <w:r>
-        <w:t xml:space="preserve">6. </w:t>
-      </w:r>
+        <w:t>Implementation Formula:</w:t>
+      </w:r>
+      <w:r>
+        <w:t xml:space="preserve"> `loan_to_inc = loan_amnt / (annual_inc + 1.0)`</w:t>
+      </w:r>
+    </w:p>
+    <w:p>
+      <w:pPr>
+        <w:pStyle w:val="ListBullet"/>
+        <w:spacing w:after="60" w:line="276" w:lineRule="auto"/>
+      </w:pPr>
+      <w:r/>
       <w:r>
         <w:rPr>
           <w:b/>
         </w:rPr>
-        <w:t>`revol_to_inc`:</w:t>
-      </w:r>
-      <w:r>
-        <w:t xml:space="preserve"> Total revolving credit balance relative to annual income:</w:t>
-      </w:r>
+        <w:t>Mathematical Formulation:</w:t>
+      </w:r>
+      <w:r/>
     </w:p>
     <w:p>
       <w:pPr>
         <w:spacing w:after="100" w:line="276" w:lineRule="auto"/>
       </w:pPr>
       <w:r>
-        <w:t>$$\text{revol\_to\_inc} = \frac{\text{revol\_bal}}{\text{annual\_inc} + 1}$$</w:t>
+        <w:t>$$\text{Loan-to-Income} = \frac{\text{Loan Principal Requested}}{\text{Annual Income} + 1}$$</w:t>
+      </w:r>
+    </w:p>
+    <w:p>
+      <w:pPr>
+        <w:pStyle w:val="ListBullet"/>
+        <w:spacing w:after="60" w:line="276" w:lineRule="auto"/>
+      </w:pPr>
+      <w:r>
+        <w:t>*Underwriting Hypothesis:* Borrowers requesting loans exceeding 40% of their annual salary carry substantially higher default hazard rates.</w:t>
+      </w:r>
+    </w:p>
+    <w:p>
+      <w:pPr>
+        <w:spacing w:after="100" w:line="276" w:lineRule="auto"/>
+      </w:pPr>
+      <w:r>
+        <w:t xml:space="preserve">3. </w:t>
+      </w:r>
+      <w:r>
+        <w:rPr>
+          <w:b/>
+        </w:rPr>
+        <w:t>`interest_burden_annual` (Gross Annual Interest Cost):</w:t>
+      </w:r>
+      <w:r/>
+    </w:p>
+    <w:p>
+      <w:pPr>
+        <w:pStyle w:val="ListBullet"/>
+        <w:spacing w:after="60" w:line="276" w:lineRule="auto"/>
+      </w:pPr>
+      <w:r/>
+      <w:r>
+        <w:rPr>
+          <w:b/>
+        </w:rPr>
+        <w:t>Implementation Formula:</w:t>
+      </w:r>
+      <w:r>
+        <w:t xml:space="preserve"> `interest_burden_annual = loan_amnt * (int_rate / 100.0)`</w:t>
+      </w:r>
+    </w:p>
+    <w:p>
+      <w:pPr>
+        <w:pStyle w:val="ListBullet"/>
+        <w:spacing w:after="60" w:line="276" w:lineRule="auto"/>
+      </w:pPr>
+      <w:r/>
+      <w:r>
+        <w:rPr>
+          <w:b/>
+        </w:rPr>
+        <w:t>Mathematical Formulation:</w:t>
+      </w:r>
+      <w:r/>
+    </w:p>
+    <w:p>
+      <w:pPr>
+        <w:spacing w:after="100" w:line="276" w:lineRule="auto"/>
+      </w:pPr>
+      <w:r>
+        <w:t>$$\text{Annual Interest Burden} = \text{Loan Amount} \times \left(\frac{\text{Interest Rate}}{100}\right)$$</w:t>
+      </w:r>
+    </w:p>
+    <w:p>
+      <w:pPr>
+        <w:pStyle w:val="ListBullet"/>
+        <w:spacing w:after="60" w:line="276" w:lineRule="auto"/>
+      </w:pPr>
+      <w:r>
+        <w:t>*Underwriting Hypothesis:* High compounding interest carry accelerates credit deterioration and borrower delinquency.</w:t>
+      </w:r>
+    </w:p>
+    <w:p>
+      <w:pPr>
+        <w:spacing w:after="100" w:line="276" w:lineRule="auto"/>
+      </w:pPr>
+      <w:r>
+        <w:t xml:space="preserve">4. </w:t>
+      </w:r>
+      <w:r>
+        <w:rPr>
+          <w:b/>
+        </w:rPr>
+        <w:t>`high_util_flag` (Revolving Line Stress Indicator):</w:t>
+      </w:r>
+      <w:r/>
+    </w:p>
+    <w:p>
+      <w:pPr>
+        <w:pStyle w:val="ListBullet"/>
+        <w:spacing w:after="60" w:line="276" w:lineRule="auto"/>
+      </w:pPr>
+      <w:r/>
+      <w:r>
+        <w:rPr>
+          <w:b/>
+        </w:rPr>
+        <w:t>Implementation Formula:</w:t>
+      </w:r>
+      <w:r>
+        <w:t xml:space="preserve"> `high_util_flag = 1 if revol_util &gt; 75.0 else 0`</w:t>
+      </w:r>
+    </w:p>
+    <w:p>
+      <w:pPr>
+        <w:pStyle w:val="ListBullet"/>
+        <w:spacing w:after="60" w:line="276" w:lineRule="auto"/>
+      </w:pPr>
+      <w:r/>
+      <w:r>
+        <w:rPr>
+          <w:b/>
+        </w:rPr>
+        <w:t>Mathematical Formulation:</w:t>
+      </w:r>
+      <w:r/>
+    </w:p>
+    <w:p>
+      <w:pPr>
+        <w:spacing w:after="100" w:line="276" w:lineRule="auto"/>
+      </w:pPr>
+      <w:r>
+        <w:t>$$\text{High Utilization Flag} = \begin{cases} 1 &amp; \text{if Revolving Line Utilization} &gt; 75\% \\ 0 &amp; \text{otherwise} \end{cases}$$</w:t>
+      </w:r>
+    </w:p>
+    <w:p>
+      <w:pPr>
+        <w:pStyle w:val="ListBullet"/>
+        <w:spacing w:after="60" w:line="276" w:lineRule="auto"/>
+      </w:pPr>
+      <w:r>
+        <w:t>*Underwriting Hypothesis:* Maxed-out revolving credit limits indicate acute personal liquidity distress.</w:t>
+      </w:r>
+    </w:p>
+    <w:p>
+      <w:pPr>
+        <w:spacing w:after="100" w:line="276" w:lineRule="auto"/>
+      </w:pPr>
+      <w:r>
+        <w:t xml:space="preserve">5. </w:t>
+      </w:r>
+      <w:r>
+        <w:rPr>
+          <w:b/>
+        </w:rPr>
+        <w:t>`derogatory_flag` (Prior Credit Bureau Delinquency):</w:t>
+      </w:r>
+      <w:r/>
+    </w:p>
+    <w:p>
+      <w:pPr>
+        <w:pStyle w:val="ListBullet"/>
+        <w:spacing w:after="60" w:line="276" w:lineRule="auto"/>
+      </w:pPr>
+      <w:r/>
+      <w:r>
+        <w:rPr>
+          <w:b/>
+        </w:rPr>
+        <w:t>Implementation Formula:</w:t>
+      </w:r>
+      <w:r>
+        <w:t xml:space="preserve"> `derogatory_flag = 1 if (delinq_2yrs &gt; 0 or pub_rec &gt; 0) else 0`</w:t>
+      </w:r>
+    </w:p>
+    <w:p>
+      <w:pPr>
+        <w:pStyle w:val="ListBullet"/>
+        <w:spacing w:after="60" w:line="276" w:lineRule="auto"/>
+      </w:pPr>
+      <w:r/>
+      <w:r>
+        <w:rPr>
+          <w:b/>
+        </w:rPr>
+        <w:t>Mathematical Formulation:</w:t>
+      </w:r>
+      <w:r/>
+    </w:p>
+    <w:p>
+      <w:pPr>
+        <w:spacing w:after="100" w:line="276" w:lineRule="auto"/>
+      </w:pPr>
+      <w:r>
+        <w:t>$$\text{Derogatory Flag} = \begin{cases} 1 &amp; \text{if 30+ Days Delinquencies} &gt; 0 \text{ or Public Derogatory Records} &gt; 0 \\ 0 &amp; \text{otherwise} \end{cases}$$</w:t>
+      </w:r>
+    </w:p>
+    <w:p>
+      <w:pPr>
+        <w:pStyle w:val="ListBullet"/>
+        <w:spacing w:after="60" w:line="276" w:lineRule="auto"/>
+      </w:pPr>
+      <w:r>
+        <w:t>*Underwriting Hypothesis:* Borrowers with historical delinquencies or bankruptcies display higher recurrence of default.</w:t>
+      </w:r>
+    </w:p>
+    <w:p>
+      <w:pPr>
+        <w:spacing w:after="100" w:line="276" w:lineRule="auto"/>
+      </w:pPr>
+      <w:r>
+        <w:t xml:space="preserve">6. </w:t>
+      </w:r>
+      <w:r>
+        <w:rPr>
+          <w:b/>
+        </w:rPr>
+        <w:t>`revol_to_inc` (Revolving Balance Leverage):</w:t>
+      </w:r>
+      <w:r/>
+    </w:p>
+    <w:p>
+      <w:pPr>
+        <w:pStyle w:val="ListBullet"/>
+        <w:spacing w:after="60" w:line="276" w:lineRule="auto"/>
+      </w:pPr>
+      <w:r/>
+      <w:r>
+        <w:rPr>
+          <w:b/>
+        </w:rPr>
+        <w:t>Implementation Formula:</w:t>
+      </w:r>
+      <w:r>
+        <w:t xml:space="preserve"> `revol_to_inc = revol_bal / (annual_inc + 1.0)`</w:t>
+      </w:r>
+    </w:p>
+    <w:p>
+      <w:pPr>
+        <w:pStyle w:val="ListBullet"/>
+        <w:spacing w:after="60" w:line="276" w:lineRule="auto"/>
+      </w:pPr>
+      <w:r/>
+      <w:r>
+        <w:rPr>
+          <w:b/>
+        </w:rPr>
+        <w:t>Mathematical Formulation:</w:t>
+      </w:r>
+      <w:r/>
+    </w:p>
+    <w:p>
+      <w:pPr>
+        <w:spacing w:after="100" w:line="276" w:lineRule="auto"/>
+      </w:pPr>
+      <w:r>
+        <w:t>$$\text{Revolving-to-Income} = \frac{\text{Total Revolving Balance}}{\text{Annual Income} + 1}$$</w:t>
+      </w:r>
+    </w:p>
+    <w:p>
+      <w:pPr>
+        <w:pStyle w:val="ListBullet"/>
+        <w:spacing w:after="60" w:line="276" w:lineRule="auto"/>
+      </w:pPr>
+      <w:r>
+        <w:t>*Underwriting Hypothesis:* High revolving debt relative to annual earnings impairs long-term debt-servicing capacity.</w:t>
       </w:r>
     </w:p>
     <w:p>
@@ -5979,7 +6456,7 @@
         <w:t>Logarithmic Transformation:</w:t>
       </w:r>
       <w:r>
-        <w:t xml:space="preserve"> Applied to annual income ($\ln(1 + \text{annual\_inc})$) to stabilize variance.</w:t>
+        <w:t xml:space="preserve"> Applied to annual income (`np.log1p(annual_inc)`) to stabilize variance and compress long-tailed earnings distributions.</w:t>
       </w:r>
     </w:p>
     <w:p>
@@ -5995,7 +6472,7 @@
         <w:t>FICO Consolidation:</w:t>
       </w:r>
       <w:r>
-        <w:t xml:space="preserve"> Consolidated `fico_range_low` and `fico_range_high` into a single mid-point metric `fico_avg`.</w:t>
+        <w:t xml:space="preserve"> Consolidated `fico_range_low` and `fico_range_high` into a single mid-point metric `fico_avg = (fico_range_low + fico_range_high) / 2.0`.</w:t>
       </w:r>
     </w:p>
     <w:p>
@@ -8060,6 +8537,60 @@
     </w:p>
     <w:p>
       <w:pPr>
+        <w:spacing w:before="200" w:after="80"/>
+        <w:jc w:val="center"/>
+      </w:pPr>
+      <w:r>
+        <w:drawing>
+          <wp:inline xmlns:a="http://schemas.openxmlformats.org/drawingml/2006/main" xmlns:pic="http://schemas.openxmlformats.org/drawingml/2006/picture">
+            <wp:extent cx="5120640" cy="2317819"/>
+            <wp:docPr id="6" name="Picture 6"/>
+            <wp:cNvGraphicFramePr>
+              <a:graphicFrameLocks noChangeAspect="1"/>
+            </wp:cNvGraphicFramePr>
+            <a:graphic>
+              <a:graphicData uri="http://schemas.openxmlformats.org/drawingml/2006/picture">
+                <pic:pic>
+                  <pic:nvPicPr>
+                    <pic:cNvPr id="0" name="fig6_pipeline_architecture.png"/>
+                    <pic:cNvPicPr/>
+                  </pic:nvPicPr>
+                  <pic:blipFill>
+                    <a:blip r:embed="rId14"/>
+                    <a:stretch>
+                      <a:fillRect/>
+                    </a:stretch>
+                  </pic:blipFill>
+                  <pic:spPr>
+                    <a:xfrm>
+                      <a:off x="0" y="0"/>
+                      <a:ext cx="5120640" cy="2317819"/>
+                    </a:xfrm>
+                    <a:prstGeom prst="rect"/>
+                  </pic:spPr>
+                </pic:pic>
+              </a:graphicData>
+            </a:graphic>
+          </wp:inline>
+        </w:drawing>
+      </w:r>
+    </w:p>
+    <w:p>
+      <w:pPr>
+        <w:spacing w:before="40" w:after="200"/>
+        <w:jc w:val="center"/>
+      </w:pPr>
+      <w:r>
+        <w:rPr>
+          <w:i/>
+          <w:color w:val="64748B"/>
+          <w:sz w:val="19"/>
+        </w:rPr>
+        <w:t>Figure 6: Leak-free ColumnTransformer and LightGBM production pipeline architecture.</w:t>
+      </w:r>
+    </w:p>
+    <w:p>
+      <w:pPr>
         <w:pStyle w:val="ListBullet"/>
         <w:spacing w:after="60" w:line="276" w:lineRule="auto"/>
       </w:pPr>
@@ -9647,6 +10178,60 @@
       </w:r>
     </w:p>
     <w:p>
+      <w:pPr>
+        <w:spacing w:before="200" w:after="80"/>
+        <w:jc w:val="center"/>
+      </w:pPr>
+      <w:r>
+        <w:drawing>
+          <wp:inline xmlns:a="http://schemas.openxmlformats.org/drawingml/2006/main" xmlns:pic="http://schemas.openxmlformats.org/drawingml/2006/picture">
+            <wp:extent cx="5120640" cy="4389120"/>
+            <wp:docPr id="7" name="Picture 7"/>
+            <wp:cNvGraphicFramePr>
+              <a:graphicFrameLocks noChangeAspect="1"/>
+            </wp:cNvGraphicFramePr>
+            <a:graphic>
+              <a:graphicData uri="http://schemas.openxmlformats.org/drawingml/2006/picture">
+                <pic:pic>
+                  <pic:nvPicPr>
+                    <pic:cNvPr id="0" name="fig7_roc_curves.png"/>
+                    <pic:cNvPicPr/>
+                  </pic:nvPicPr>
+                  <pic:blipFill>
+                    <a:blip r:embed="rId15"/>
+                    <a:stretch>
+                      <a:fillRect/>
+                    </a:stretch>
+                  </pic:blipFill>
+                  <pic:spPr>
+                    <a:xfrm>
+                      <a:off x="0" y="0"/>
+                      <a:ext cx="5120640" cy="4389120"/>
+                    </a:xfrm>
+                    <a:prstGeom prst="rect"/>
+                  </pic:spPr>
+                </pic:pic>
+              </a:graphicData>
+            </a:graphic>
+          </wp:inline>
+        </w:drawing>
+      </w:r>
+    </w:p>
+    <w:p>
+      <w:pPr>
+        <w:spacing w:before="40" w:after="200"/>
+        <w:jc w:val="center"/>
+      </w:pPr>
+      <w:r>
+        <w:rPr>
+          <w:i/>
+          <w:color w:val="64748B"/>
+          <w:sz w:val="19"/>
+        </w:rPr>
+        <w:t>Figure 7: Comparative Receiver Operating Characteristic (ROC) curves across 6 evaluated classification models.</w:t>
+      </w:r>
+    </w:p>
+    <w:p>
       <w:r>
         <w:br w:type="page"/>
       </w:r>
@@ -11061,6 +11646,114 @@
       <w:pPr>
         <w:spacing w:after="80"/>
       </w:pPr>
+    </w:p>
+    <w:p>
+      <w:pPr>
+        <w:spacing w:before="200" w:after="80"/>
+        <w:jc w:val="center"/>
+      </w:pPr>
+      <w:r>
+        <w:drawing>
+          <wp:inline xmlns:a="http://schemas.openxmlformats.org/drawingml/2006/main" xmlns:pic="http://schemas.openxmlformats.org/drawingml/2006/picture">
+            <wp:extent cx="5120640" cy="4389120"/>
+            <wp:docPr id="8" name="Picture 8"/>
+            <wp:cNvGraphicFramePr>
+              <a:graphicFrameLocks noChangeAspect="1"/>
+            </wp:cNvGraphicFramePr>
+            <a:graphic>
+              <a:graphicData uri="http://schemas.openxmlformats.org/drawingml/2006/picture">
+                <pic:pic>
+                  <pic:nvPicPr>
+                    <pic:cNvPr id="0" name="fig8_pr_curve.png"/>
+                    <pic:cNvPicPr/>
+                  </pic:nvPicPr>
+                  <pic:blipFill>
+                    <a:blip r:embed="rId16"/>
+                    <a:stretch>
+                      <a:fillRect/>
+                    </a:stretch>
+                  </pic:blipFill>
+                  <pic:spPr>
+                    <a:xfrm>
+                      <a:off x="0" y="0"/>
+                      <a:ext cx="5120640" cy="4389120"/>
+                    </a:xfrm>
+                    <a:prstGeom prst="rect"/>
+                  </pic:spPr>
+                </pic:pic>
+              </a:graphicData>
+            </a:graphic>
+          </wp:inline>
+        </w:drawing>
+      </w:r>
+    </w:p>
+    <w:p>
+      <w:pPr>
+        <w:spacing w:before="40" w:after="200"/>
+        <w:jc w:val="center"/>
+      </w:pPr>
+      <w:r>
+        <w:rPr>
+          <w:i/>
+          <w:color w:val="64748B"/>
+          <w:sz w:val="19"/>
+        </w:rPr>
+        <w:t>Figure 8: Precision-Recall curve illustrating the calibrated operating threshold (tau = 0.36) achieving 86.50% recall at 77.36% precision.</w:t>
+      </w:r>
+    </w:p>
+    <w:p>
+      <w:pPr>
+        <w:spacing w:before="200" w:after="80"/>
+        <w:jc w:val="center"/>
+      </w:pPr>
+      <w:r>
+        <w:drawing>
+          <wp:inline xmlns:a="http://schemas.openxmlformats.org/drawingml/2006/main" xmlns:pic="http://schemas.openxmlformats.org/drawingml/2006/picture">
+            <wp:extent cx="5120640" cy="4267200"/>
+            <wp:docPr id="9" name="Picture 9"/>
+            <wp:cNvGraphicFramePr>
+              <a:graphicFrameLocks noChangeAspect="1"/>
+            </wp:cNvGraphicFramePr>
+            <a:graphic>
+              <a:graphicData uri="http://schemas.openxmlformats.org/drawingml/2006/picture">
+                <pic:pic>
+                  <pic:nvPicPr>
+                    <pic:cNvPr id="0" name="fig9_confusion_matrix.png"/>
+                    <pic:cNvPicPr/>
+                  </pic:nvPicPr>
+                  <pic:blipFill>
+                    <a:blip r:embed="rId17"/>
+                    <a:stretch>
+                      <a:fillRect/>
+                    </a:stretch>
+                  </pic:blipFill>
+                  <pic:spPr>
+                    <a:xfrm>
+                      <a:off x="0" y="0"/>
+                      <a:ext cx="5120640" cy="4267200"/>
+                    </a:xfrm>
+                    <a:prstGeom prst="rect"/>
+                  </pic:spPr>
+                </pic:pic>
+              </a:graphicData>
+            </a:graphic>
+          </wp:inline>
+        </w:drawing>
+      </w:r>
+    </w:p>
+    <w:p>
+      <w:pPr>
+        <w:spacing w:before="40" w:after="200"/>
+        <w:jc w:val="center"/>
+      </w:pPr>
+      <w:r>
+        <w:rPr>
+          <w:i/>
+          <w:color w:val="64748B"/>
+          <w:sz w:val="19"/>
+        </w:rPr>
+        <w:t>Figure 9: Confusion matrix on 20,000 holdout test loans at the calibrated operating threshold (tau = 0.36).</w:t>
+      </w:r>
     </w:p>
     <w:p>
       <w:pPr>
@@ -13220,6 +13913,60 @@
     </w:p>
     <w:p>
       <w:pPr>
+        <w:spacing w:before="200" w:after="80"/>
+        <w:jc w:val="center"/>
+      </w:pPr>
+      <w:r>
+        <w:drawing>
+          <wp:inline xmlns:a="http://schemas.openxmlformats.org/drawingml/2006/main" xmlns:pic="http://schemas.openxmlformats.org/drawingml/2006/picture">
+            <wp:extent cx="5120640" cy="2215261"/>
+            <wp:docPr id="10" name="Picture 10"/>
+            <wp:cNvGraphicFramePr>
+              <a:graphicFrameLocks noChangeAspect="1"/>
+            </wp:cNvGraphicFramePr>
+            <a:graphic>
+              <a:graphicData uri="http://schemas.openxmlformats.org/drawingml/2006/picture">
+                <pic:pic>
+                  <pic:nvPicPr>
+                    <pic:cNvPr id="0" name="fig10_lift_gain_curve.png"/>
+                    <pic:cNvPicPr/>
+                  </pic:nvPicPr>
+                  <pic:blipFill>
+                    <a:blip r:embed="rId18"/>
+                    <a:stretch>
+                      <a:fillRect/>
+                    </a:stretch>
+                  </pic:blipFill>
+                  <pic:spPr>
+                    <a:xfrm>
+                      <a:off x="0" y="0"/>
+                      <a:ext cx="5120640" cy="2215261"/>
+                    </a:xfrm>
+                    <a:prstGeom prst="rect"/>
+                  </pic:spPr>
+                </pic:pic>
+              </a:graphicData>
+            </a:graphic>
+          </wp:inline>
+        </w:drawing>
+      </w:r>
+    </w:p>
+    <w:p>
+      <w:pPr>
+        <w:spacing w:before="40" w:after="200"/>
+        <w:jc w:val="center"/>
+      </w:pPr>
+      <w:r>
+        <w:rPr>
+          <w:i/>
+          <w:color w:val="64748B"/>
+          <w:sz w:val="19"/>
+        </w:rPr>
+        <w:t>Figure 10: Cumulative gain and decile lift charts demonstrating 70.17% default concentration in the top 3 risk deciles.</w:t>
+      </w:r>
+    </w:p>
+    <w:p>
+      <w:pPr>
         <w:pStyle w:val="Heading3"/>
         <w:spacing w:before="200" w:after="60"/>
       </w:pPr>
@@ -13248,6 +13995,60 @@
       </w:r>
       <w:r>
         <w:t>). Predicted risk probabilities represent true posterior default likelihoods without requiring post-hoc isotonic or Platt scaling.</w:t>
+      </w:r>
+    </w:p>
+    <w:p>
+      <w:pPr>
+        <w:spacing w:before="200" w:after="80"/>
+        <w:jc w:val="center"/>
+      </w:pPr>
+      <w:r>
+        <w:drawing>
+          <wp:inline xmlns:a="http://schemas.openxmlformats.org/drawingml/2006/main" xmlns:pic="http://schemas.openxmlformats.org/drawingml/2006/picture">
+            <wp:extent cx="5120640" cy="4389120"/>
+            <wp:docPr id="11" name="Picture 11"/>
+            <wp:cNvGraphicFramePr>
+              <a:graphicFrameLocks noChangeAspect="1"/>
+            </wp:cNvGraphicFramePr>
+            <a:graphic>
+              <a:graphicData uri="http://schemas.openxmlformats.org/drawingml/2006/picture">
+                <pic:pic>
+                  <pic:nvPicPr>
+                    <pic:cNvPr id="0" name="fig11_calibration_curve.png"/>
+                    <pic:cNvPicPr/>
+                  </pic:nvPicPr>
+                  <pic:blipFill>
+                    <a:blip r:embed="rId19"/>
+                    <a:stretch>
+                      <a:fillRect/>
+                    </a:stretch>
+                  </pic:blipFill>
+                  <pic:spPr>
+                    <a:xfrm>
+                      <a:off x="0" y="0"/>
+                      <a:ext cx="5120640" cy="4389120"/>
+                    </a:xfrm>
+                    <a:prstGeom prst="rect"/>
+                  </pic:spPr>
+                </pic:pic>
+              </a:graphicData>
+            </a:graphic>
+          </wp:inline>
+        </w:drawing>
+      </w:r>
+    </w:p>
+    <w:p>
+      <w:pPr>
+        <w:spacing w:before="40" w:after="200"/>
+        <w:jc w:val="center"/>
+      </w:pPr>
+      <w:r>
+        <w:rPr>
+          <w:i/>
+          <w:color w:val="64748B"/>
+          <w:sz w:val="19"/>
+        </w:rPr>
+        <w:t>Figure 11: Calibration reliability diagram comparing predicted default probabilities against observed empirical frequencies (Brier Score = 0.0894).</w:t>
       </w:r>
     </w:p>
     <w:p>
@@ -13899,6 +14700,124 @@
       </w:r>
     </w:p>
     <w:p>
+      <w:pPr>
+        <w:pStyle w:val="Heading3"/>
+        <w:spacing w:before="200" w:after="60"/>
+      </w:pPr>
+      <w:r>
+        <w:rPr>
+          <w:rFonts w:ascii="Calibri" w:hAnsi="Calibri"/>
+          <w:b/>
+          <w:color w:val="334155"/>
+          <w:sz w:val="24"/>
+        </w:rPr>
+        <w:t>10.7 Explainable AI (XAI) &amp; SHAP TreeExplainer</w:t>
+      </w:r>
+    </w:p>
+    <w:p>
+      <w:pPr>
+        <w:spacing w:after="100" w:line="276" w:lineRule="auto"/>
+      </w:pPr>
+      <w:r>
+        <w:t xml:space="preserve">To satisfy regulatory compliance under the Fair Credit Reporting Act (FCRA) and Equal Credit Opportunity Act (ECOA), the production pipeline integrates the </w:t>
+      </w:r>
+      <w:r>
+        <w:rPr>
+          <w:b/>
+        </w:rPr>
+        <w:t>SHAP (SHapley Additive exPlanations) TreeExplainer</w:t>
+      </w:r>
+      <w:r>
+        <w:t xml:space="preserve"> framework. Shapley values allocate fair, additive contributions to each input feature:</w:t>
+      </w:r>
+    </w:p>
+    <w:p>
+      <w:pPr>
+        <w:spacing w:before="200" w:after="80"/>
+        <w:jc w:val="center"/>
+      </w:pPr>
+      <w:r>
+        <w:drawing>
+          <wp:inline xmlns:a="http://schemas.openxmlformats.org/drawingml/2006/main" xmlns:pic="http://schemas.openxmlformats.org/drawingml/2006/picture">
+            <wp:extent cx="5120640" cy="3840480"/>
+            <wp:docPr id="12" name="Picture 12"/>
+            <wp:cNvGraphicFramePr>
+              <a:graphicFrameLocks noChangeAspect="1"/>
+            </wp:cNvGraphicFramePr>
+            <a:graphic>
+              <a:graphicData uri="http://schemas.openxmlformats.org/drawingml/2006/picture">
+                <pic:pic>
+                  <pic:nvPicPr>
+                    <pic:cNvPr id="0" name="fig12_shap_importance.png"/>
+                    <pic:cNvPicPr/>
+                  </pic:nvPicPr>
+                  <pic:blipFill>
+                    <a:blip r:embed="rId20"/>
+                    <a:stretch>
+                      <a:fillRect/>
+                    </a:stretch>
+                  </pic:blipFill>
+                  <pic:spPr>
+                    <a:xfrm>
+                      <a:off x="0" y="0"/>
+                      <a:ext cx="5120640" cy="3840480"/>
+                    </a:xfrm>
+                    <a:prstGeom prst="rect"/>
+                  </pic:spPr>
+                </pic:pic>
+              </a:graphicData>
+            </a:graphic>
+          </wp:inline>
+        </w:drawing>
+      </w:r>
+    </w:p>
+    <w:p>
+      <w:pPr>
+        <w:spacing w:before="40" w:after="200"/>
+        <w:jc w:val="center"/>
+      </w:pPr>
+      <w:r>
+        <w:rPr>
+          <w:i/>
+          <w:color w:val="64748B"/>
+          <w:sz w:val="19"/>
+        </w:rPr>
+        <w:t>Figure 12: Global SHAP feature attribution ranking the top 12 drivers of credit default risk.</w:t>
+      </w:r>
+    </w:p>
+    <w:p>
+      <w:pPr>
+        <w:pStyle w:val="ListBullet"/>
+        <w:spacing w:after="60" w:line="276" w:lineRule="auto"/>
+      </w:pPr>
+      <w:r/>
+      <w:r>
+        <w:rPr>
+          <w:b/>
+        </w:rPr>
+        <w:t>Key Attribution Drivers:</w:t>
+      </w:r>
+      <w:r>
+        <w:t xml:space="preserve"> Loan credit grade and sub-grade contribute the largest absolute shift in log-odds default risk, followed closely by loan interest rate, average FICO score, and the engineered `installment_to_inc` and `interest_burden_annual` ratios.</w:t>
+      </w:r>
+    </w:p>
+    <w:p>
+      <w:pPr>
+        <w:pStyle w:val="ListBullet"/>
+        <w:spacing w:after="60" w:line="276" w:lineRule="auto"/>
+      </w:pPr>
+      <w:r/>
+      <w:r>
+        <w:rPr>
+          <w:b/>
+        </w:rPr>
+        <w:t>Regulatory Compliance:</w:t>
+      </w:r>
+      <w:r>
+        <w:t xml:space="preserve"> For every rejected loan application ($\hat{p} \ge 0.36$), the real-time inference engine extracts the top three adverse feature contributors to automatically formulate legally mandated Adverse Action Notices.</w:t>
+      </w:r>
+    </w:p>
+    <w:p>
       <w:r>
         <w:br w:type="page"/>
       </w:r>
@@ -14569,7 +15488,7 @@
         <w:spacing w:after="100" w:line="276" w:lineRule="auto"/>
       </w:pPr>
       <w:r>
-        <w:t>$$C_{FN} = \text{Avg. Loan Amount} \times (1 - \text{Recovery Rate}) = \$15,000 \times 0.70 = \$10,500$$</w:t>
+        <w:t>*Formula:* `C_FN = Avg_Loan_Amount * (1 - Recovery_Rate) = $15,000 * 0.70 = $10,500`</w:t>
       </w:r>
     </w:p>
     <w:p>
@@ -14593,7 +15512,7 @@
         <w:spacing w:after="100" w:line="276" w:lineRule="auto"/>
       </w:pPr>
       <w:r>
-        <w:t>$$C_{FP} = \text{Avg. Loan Amount} \times \text{Net Interest Margin} = \$15,000 \times 0.12 = \$1,800$$</w:t>
+        <w:t>*Formula:* `C_FP = Avg_Loan_Amount * Net_Interest_Margin = $15,000 * 0.12 = $1,800`</w:t>
       </w:r>
     </w:p>
     <w:p>
@@ -14606,10 +15525,10 @@
         <w:rPr>
           <w:b/>
         </w:rPr>
-        <w:t>Cost Ratio:</w:t>
-      </w:r>
-      <w:r>
-        <w:t xml:space="preserve"> $C_{FN} / C_{FP} = 10,500 / 1,800 \approx 5.83$. False negatives are </w:t>
+        <w:t>Cost Asymmetry Ratio:</w:t>
+      </w:r>
+      <w:r>
+        <w:t xml:space="preserve"> `C_FN / C_FP = 10,500 / 1,800 = 5.83`. Approving a defaulting loan is </w:t>
       </w:r>
       <w:r>
         <w:rPr>
@@ -14618,7 +15537,61 @@
         <w:t>5.8x more expensive</w:t>
       </w:r>
       <w:r>
-        <w:t xml:space="preserve"> than false positives.</w:t>
+        <w:t xml:space="preserve"> than rejecting a solvent application.</w:t>
+      </w:r>
+    </w:p>
+    <w:p>
+      <w:pPr>
+        <w:spacing w:before="200" w:after="80"/>
+        <w:jc w:val="center"/>
+      </w:pPr>
+      <w:r>
+        <w:drawing>
+          <wp:inline xmlns:a="http://schemas.openxmlformats.org/drawingml/2006/main" xmlns:pic="http://schemas.openxmlformats.org/drawingml/2006/picture">
+            <wp:extent cx="5120640" cy="3200400"/>
+            <wp:docPr id="13" name="Picture 13"/>
+            <wp:cNvGraphicFramePr>
+              <a:graphicFrameLocks noChangeAspect="1"/>
+            </wp:cNvGraphicFramePr>
+            <a:graphic>
+              <a:graphicData uri="http://schemas.openxmlformats.org/drawingml/2006/picture">
+                <pic:pic>
+                  <pic:nvPicPr>
+                    <pic:cNvPr id="0" name="fig13_financial_gain.png"/>
+                    <pic:cNvPicPr/>
+                  </pic:nvPicPr>
+                  <pic:blipFill>
+                    <a:blip r:embed="rId21"/>
+                    <a:stretch>
+                      <a:fillRect/>
+                    </a:stretch>
+                  </pic:blipFill>
+                  <pic:spPr>
+                    <a:xfrm>
+                      <a:off x="0" y="0"/>
+                      <a:ext cx="5120640" cy="3200400"/>
+                    </a:xfrm>
+                    <a:prstGeom prst="rect"/>
+                  </pic:spPr>
+                </pic:pic>
+              </a:graphicData>
+            </a:graphic>
+          </wp:inline>
+        </w:drawing>
+      </w:r>
+    </w:p>
+    <w:p>
+      <w:pPr>
+        <w:spacing w:before="40" w:after="200"/>
+        <w:jc w:val="center"/>
+      </w:pPr>
+      <w:r>
+        <w:rPr>
+          <w:i/>
+          <w:color w:val="64748B"/>
+          <w:sz w:val="19"/>
+        </w:rPr>
+        <w:t>Figure 13: Net economic capital portfolio value across classification thresholds, peaking at the optimal operating cutoff tau = 0.36 ($78.4 Million net benefit).</w:t>
       </w:r>
     </w:p>
     <w:p>
@@ -17802,6 +18775,129 @@
       </w:r>
       <w:r>
         <w:t xml:space="preserve"> Allows credit officers to select borrower presets (Safe vs. Risky vs. Custom Profile), input 8 core financial variables, and receive instantaneous approval decisions, monthly EMI projections, and zero-overlap safety spectrum visualizations.</w:t>
+      </w:r>
+    </w:p>
+    <w:p>
+      <w:pPr>
+        <w:spacing w:before="200" w:after="80"/>
+        <w:jc w:val="center"/>
+      </w:pPr>
+      <w:r>
+        <w:drawing>
+          <wp:inline xmlns:a="http://schemas.openxmlformats.org/drawingml/2006/main" xmlns:pic="http://schemas.openxmlformats.org/drawingml/2006/picture">
+            <wp:extent cx="5120640" cy="2816352"/>
+            <wp:docPr id="14" name="Picture 14"/>
+            <wp:cNvGraphicFramePr>
+              <a:graphicFrameLocks noChangeAspect="1"/>
+            </wp:cNvGraphicFramePr>
+            <a:graphic>
+              <a:graphicData uri="http://schemas.openxmlformats.org/drawingml/2006/picture">
+                <pic:pic>
+                  <pic:nvPicPr>
+                    <pic:cNvPr id="0" name="fig14_executive_overview.png"/>
+                    <pic:cNvPicPr/>
+                  </pic:nvPicPr>
+                  <pic:blipFill>
+                    <a:blip r:embed="rId22"/>
+                    <a:stretch>
+                      <a:fillRect/>
+                    </a:stretch>
+                  </pic:blipFill>
+                  <pic:spPr>
+                    <a:xfrm>
+                      <a:off x="0" y="0"/>
+                      <a:ext cx="5120640" cy="2816352"/>
+                    </a:xfrm>
+                    <a:prstGeom prst="rect"/>
+                  </pic:spPr>
+                </pic:pic>
+              </a:graphicData>
+            </a:graphic>
+          </wp:inline>
+        </w:drawing>
+      </w:r>
+    </w:p>
+    <w:p>
+      <w:pPr>
+        <w:spacing w:before="40" w:after="200"/>
+        <w:jc w:val="center"/>
+      </w:pPr>
+      <w:r>
+        <w:rPr>
+          <w:i/>
+          <w:color w:val="64748B"/>
+          <w:sz w:val="19"/>
+        </w:rPr>
+        <w:t>Figure 14: Production Streamlit executive portfolio monitoring dashboard with real-time KPI metrics and multi-model benchmark comparisons.</w:t>
+      </w:r>
+    </w:p>
+    <w:p>
+      <w:pPr>
+        <w:pStyle w:val="Heading4"/>
+        <w:spacing w:before="160" w:after="40"/>
+      </w:pPr>
+      <w:r>
+        <w:rPr>
+          <w:rFonts w:ascii="Calibri" w:hAnsi="Calibri"/>
+          <w:b/>
+          <w:color w:val="475569"/>
+          <w:sz w:val="22"/>
+        </w:rPr>
+        <w:t>C.2 Live Underwriting &amp; Prediction Decision Engine</w:t>
+      </w:r>
+    </w:p>
+    <w:p>
+      <w:pPr>
+        <w:spacing w:before="200" w:after="80"/>
+        <w:jc w:val="center"/>
+      </w:pPr>
+      <w:r>
+        <w:drawing>
+          <wp:inline xmlns:a="http://schemas.openxmlformats.org/drawingml/2006/main" xmlns:pic="http://schemas.openxmlformats.org/drawingml/2006/picture">
+            <wp:extent cx="5120640" cy="2816352"/>
+            <wp:docPr id="15" name="Picture 15"/>
+            <wp:cNvGraphicFramePr>
+              <a:graphicFrameLocks noChangeAspect="1"/>
+            </wp:cNvGraphicFramePr>
+            <a:graphic>
+              <a:graphicData uri="http://schemas.openxmlformats.org/drawingml/2006/picture">
+                <pic:pic>
+                  <pic:nvPicPr>
+                    <pic:cNvPr id="0" name="fig15_live_prediction.png"/>
+                    <pic:cNvPicPr/>
+                  </pic:nvPicPr>
+                  <pic:blipFill>
+                    <a:blip r:embed="rId23"/>
+                    <a:stretch>
+                      <a:fillRect/>
+                    </a:stretch>
+                  </pic:blipFill>
+                  <pic:spPr>
+                    <a:xfrm>
+                      <a:off x="0" y="0"/>
+                      <a:ext cx="5120640" cy="2816352"/>
+                    </a:xfrm>
+                    <a:prstGeom prst="rect"/>
+                  </pic:spPr>
+                </pic:pic>
+              </a:graphicData>
+            </a:graphic>
+          </wp:inline>
+        </w:drawing>
+      </w:r>
+    </w:p>
+    <w:p>
+      <w:pPr>
+        <w:spacing w:before="40" w:after="200"/>
+        <w:jc w:val="center"/>
+      </w:pPr>
+      <w:r>
+        <w:rPr>
+          <w:i/>
+          <w:color w:val="64748B"/>
+          <w:sz w:val="19"/>
+        </w:rPr>
+        <w:t>Figure 15: Production Streamlit live credit application decision engine displaying instant risk scoring, tier categorization, and SHAP explainability breakdowns.</w:t>
       </w:r>
     </w:p>
     <w:p>

</xml_diff>

<commit_message>
Update faculty advisor name to Prof. Ameya Chitnis across all reports, app, and documents
</commit_message>
<xml_diff>
--- a/RESEARCH_PROJECT_REPORT.docx
+++ b/RESEARCH_PROJECT_REPORT.docx
@@ -140,7 +140,7 @@
         <w:rPr>
           <w:b/>
         </w:rPr>
-        <w:t>Prof. Amit Chitnis</w:t>
+        <w:t>Prof. Ameya Chitnis</w:t>
       </w:r>
       <w:r/>
     </w:p>
@@ -303,7 +303,7 @@
         <w:rPr>
           <w:b/>
         </w:rPr>
-        <w:t>Prof. Amit Chitnis</w:t>
+        <w:t>Prof. Ameya Chitnis</w:t>
       </w:r>
       <w:r/>
     </w:p>
@@ -346,7 +346,7 @@
         <w:rPr>
           <w:b/>
         </w:rPr>
-        <w:t>Prof. Amit Chitnis</w:t>
+        <w:t>Prof. Ameya Chitnis</w:t>
       </w:r>
       <w:r>
         <w:t>, for his invaluable guidance, continuous intellectual mentorship, and critical technical feedback throughout this research project. His domain expertise in financial econometrics and rigorous machine learning methodologies was instrumental in framing the credit risk underwriting architecture and ensuring a leakage-free experimental design.</w:t>

</xml_diff>

<commit_message>
Refine cover page: remove School of Data Science, crisp title, centered alignment, and generate standalone cover PDF
</commit_message>
<xml_diff>
--- a/RESEARCH_PROJECT_REPORT.docx
+++ b/RESEARCH_PROJECT_REPORT.docx
@@ -5,66 +5,55 @@
     <w:p>
       <w:pPr>
         <w:pStyle w:val="Heading1"/>
-        <w:spacing w:before="280" w:after="100"/>
+        <w:spacing w:before="600" w:after="80"/>
+        <w:jc w:val="center"/>
       </w:pPr>
       <w:r>
         <w:rPr>
           <w:rFonts w:ascii="Calibri" w:hAnsi="Calibri"/>
           <w:b/>
           <w:color w:val="0F172A"/>
-          <w:sz w:val="36"/>
+          <w:sz w:val="40"/>
         </w:rPr>
-        <w:t>SCHOOL OF DATA SCIENCE &amp; BIG DATA ANALYTICS</w:t>
-      </w:r>
-    </w:p>
-    <w:p>
-      <w:pPr>
-        <w:pStyle w:val="Heading2"/>
-        <w:spacing w:before="240" w:after="80"/>
+        <w:t>M.Sc BIG DATA ANALYTICS</w:t>
+      </w:r>
+    </w:p>
+    <w:p>
+      <w:pPr>
+        <w:pStyle w:val="Heading3"/>
+        <w:spacing w:before="40" w:after="500"/>
+        <w:jc w:val="center"/>
+      </w:pPr>
+      <w:r>
+        <w:rPr>
+          <w:rFonts w:ascii="Calibri" w:hAnsi="Calibri"/>
+          <w:b/>
+          <w:color w:val="475569"/>
+          <w:sz w:val="26"/>
+        </w:rPr>
+        <w:t>RESEARCH PROJECT REPORT</w:t>
+      </w:r>
+    </w:p>
+    <w:p>
+      <w:pPr>
+        <w:pStyle w:val="Heading1"/>
+        <w:spacing w:before="500" w:after="300"/>
+        <w:jc w:val="center"/>
       </w:pPr>
       <w:r>
         <w:rPr>
           <w:rFonts w:ascii="Calibri" w:hAnsi="Calibri"/>
           <w:b/>
           <w:color w:val="1E3A8A"/>
-          <w:sz w:val="28"/>
+          <w:sz w:val="42"/>
         </w:rPr>
-        <w:t>M.Sc BIG DATA ANALYTICS</w:t>
-      </w:r>
-    </w:p>
-    <w:p>
-      <w:pPr>
-        <w:pStyle w:val="Heading3"/>
-        <w:spacing w:before="200" w:after="60"/>
-      </w:pPr>
-      <w:r>
-        <w:rPr>
-          <w:rFonts w:ascii="Calibri" w:hAnsi="Calibri"/>
-          <w:b/>
-          <w:color w:val="334155"/>
-          <w:sz w:val="24"/>
-        </w:rPr>
-        <w:t>Research Project Report</w:t>
-      </w:r>
-    </w:p>
-    <w:p>
-      <w:pPr>
-        <w:pStyle w:val="Heading1"/>
-        <w:spacing w:before="280" w:after="100"/>
-      </w:pPr>
-      <w:r>
-        <w:rPr>
-          <w:rFonts w:ascii="Calibri" w:hAnsi="Calibri"/>
-          <w:b/>
-          <w:color w:val="0F172A"/>
-          <w:sz w:val="36"/>
-        </w:rPr>
-        <w:t>100,000-LOAN CREDIT RISK &amp; DEFAULT PREDICTION SYSTEM USING CALIBRATED MACHINE LEARNING AND EXPLAINABLE AI</w:t>
-      </w:r>
-    </w:p>
-    <w:p>
-      <w:pPr>
-        <w:spacing w:after="100" w:line="276" w:lineRule="auto"/>
+        <w:t>LOAN CREDIT RISK &amp; DEFAULT PREDICTION SYSTEM USING MACHINE LEARNING</w:t>
+      </w:r>
+    </w:p>
+    <w:p>
+      <w:pPr>
+        <w:spacing w:after="160" w:line="288" w:lineRule="auto"/>
+        <w:jc w:val="center"/>
       </w:pPr>
       <w:r/>
       <w:r>
@@ -79,7 +68,8 @@
     </w:p>
     <w:p>
       <w:pPr>
-        <w:spacing w:after="100" w:line="276" w:lineRule="auto"/>
+        <w:spacing w:after="160" w:line="288" w:lineRule="auto"/>
+        <w:jc w:val="center"/>
       </w:pPr>
       <w:r/>
       <w:r>
@@ -92,7 +82,8 @@
     </w:p>
     <w:p>
       <w:pPr>
-        <w:spacing w:after="100" w:line="276" w:lineRule="auto"/>
+        <w:spacing w:after="160" w:line="288" w:lineRule="auto"/>
+        <w:jc w:val="center"/>
       </w:pPr>
       <w:r/>
       <w:r>
@@ -105,7 +96,8 @@
     </w:p>
     <w:p>
       <w:pPr>
-        <w:spacing w:after="100" w:line="276" w:lineRule="auto"/>
+        <w:spacing w:after="160" w:line="288" w:lineRule="auto"/>
+        <w:jc w:val="center"/>
       </w:pPr>
       <w:r/>
       <w:r>
@@ -120,7 +112,8 @@
     </w:p>
     <w:p>
       <w:pPr>
-        <w:spacing w:after="100" w:line="276" w:lineRule="auto"/>
+        <w:spacing w:after="160" w:line="288" w:lineRule="auto"/>
+        <w:jc w:val="center"/>
       </w:pPr>
       <w:r/>
       <w:r>
@@ -133,7 +126,8 @@
     </w:p>
     <w:p>
       <w:pPr>
-        <w:spacing w:after="100" w:line="276" w:lineRule="auto"/>
+        <w:spacing w:after="160" w:line="288" w:lineRule="auto"/>
+        <w:jc w:val="center"/>
       </w:pPr>
       <w:r/>
       <w:r>
@@ -146,18 +140,17 @@
     </w:p>
     <w:p>
       <w:pPr>
-        <w:spacing w:after="100" w:line="276" w:lineRule="auto"/>
+        <w:spacing w:after="160" w:line="288" w:lineRule="auto"/>
+        <w:jc w:val="center"/>
       </w:pPr>
       <w:r/>
       <w:r>
         <w:rPr>
           <w:b/>
         </w:rPr>
-        <w:t>Academic Year:</w:t>
-      </w:r>
-      <w:r>
-        <w:t xml:space="preserve"> September, 2026</w:t>
-      </w:r>
+        <w:t>September, 2026</w:t>
+      </w:r>
+      <w:r/>
     </w:p>
     <w:p>
       <w:r>
@@ -190,7 +183,7 @@
         <w:rPr>
           <w:b/>
         </w:rPr>
-        <w:t>"100,000-Loan Credit Risk &amp; Default Prediction System Using Calibrated Machine Learning and Explainable AI"</w:t>
+        <w:t>"Loan Credit Risk &amp; Default Prediction System Using Machine Learning"</w:t>
       </w:r>
       <w:r>
         <w:t xml:space="preserve"> submitted in partial fulfilment of the requirements for the degree of </w:t>

</xml_diff>